<commit_message>
Agregar AP por sala de ventas en diagramas y punto 21 en la bitácora
Co-Authored-By: Claude Opus 5.5 <noreply@anthropic.com>
Claude-Session: https://claude.ai/code/session_01Fjm1LhdDuDRXrKBvFUSdBx
</commit_message>
<xml_diff>
--- a/Bitacora_Evolucion_Red_Agroprodel.docx
+++ b/Bitacora_Evolucion_Red_Agroprodel.docx
@@ -819,6 +819,48 @@
     </w:p>
     <w:p>
       <w:pPr>
+        <w:keepNext/>
+        <w:spacing w:after="40" w:before="160"/>
+      </w:pPr>
+      <w:r>
+        <w:rPr>
+          <w:rFonts w:ascii="Calibri" w:cs="Calibri" w:eastAsia="Calibri" w:hAnsi="Calibri"/>
+          <w:b/>
+          <w:bCs/>
+          <w:color w:val="1F3864"/>
+          <w:sz w:val="23"/>
+          <w:szCs w:val="23"/>
+        </w:rPr>
+        <w:t xml:space="preserve">21. Access points por sala de ventas</w:t>
+      </w:r>
+      <w:r>
+        <w:rPr>
+          <w:rFonts w:ascii="Calibri" w:cs="Calibri" w:eastAsia="Calibri" w:hAnsi="Calibri"/>
+          <w:i/>
+          <w:iCs/>
+          <w:color w:val="595959"/>
+          <w:sz w:val="19"/>
+          <w:szCs w:val="19"/>
+        </w:rPr>
+        <w:t xml:space="preserve">   Aplicado al diseño</w:t>
+      </w:r>
+    </w:p>
+    <w:p>
+      <w:pPr>
+        <w:spacing w:after="80"/>
+        <w:jc w:val="both"/>
+      </w:pPr>
+      <w:r>
+        <w:rPr>
+          <w:rFonts w:ascii="Calibri" w:cs="Calibri" w:eastAsia="Calibri" w:hAnsi="Calibri"/>
+          <w:sz w:val="21"/>
+          <w:szCs w:val="21"/>
+        </w:rPr>
+        <w:t xml:space="preserve">Se definió un access point Cisco CBW150AX en la sala de ventas de cada sede (4 en total), que es el área donde el enunciado exige conectividad para clientes. El dimensionamiento combina cobertura (sala menor a 150 m²) y capacidad (10 clientes simultáneos frente a los 25–30 recomendados por AP). Se alimenta por PoE y, si la sala crece, se amplía con un segundo AP en malla (mesh) sin necesidad de controlador.</w:t>
+      </w:r>
+    </w:p>
+    <w:p>
+      <w:pPr>
         <w:sectPr>
           <w:footerReference w:type="default" r:id="rId7"/>
           <w:pgSz w:w="11906" w:h="16838" w:orient="portrait"/>

</xml_diff>